<commit_message>
Add Public Time stamp to Report.
Add Bitcoin time stamp to report provenance report.
</commit_message>
<xml_diff>
--- a/The Judaic Logic of Matthew 24 — provenance.docx
+++ b/The Judaic Logic of Matthew 24 — provenance.docx
@@ -22,7 +22,7 @@
         <w:rPr>
           <w:sz w:val="16"/>
         </w:rPr>
-        <w:t>Generated August 29, 2026 at 16:18 by WordVault 1.0 from the document's own history.</w:t>
+        <w:t>Generated August 31, 2026 at 20:51 by WordVault 1.0 from the document's own history.</w:t>
       </w:r>
     </w:p>
     <w:p>
@@ -58,7 +58,7 @@
         <w:rPr>
           <w:sz w:val="16"/>
         </w:rPr>
-        <w:t>Revisions preserved: 2283</w:t>
+        <w:t>Revisions preserved: 3006</w:t>
       </w:r>
     </w:p>
     <w:p>
@@ -70,7 +70,7 @@
         <w:rPr>
           <w:sz w:val="16"/>
         </w:rPr>
-        <w:t>Words today: 5,448</w:t>
+        <w:t>Words today: 7,131</w:t>
       </w:r>
     </w:p>
     <w:p>
@@ -82,7 +82,7 @@
         <w:rPr>
           <w:sz w:val="16"/>
         </w:rPr>
-        <w:t>Writing sessions: 30, across 11 different day(s)</w:t>
+        <w:t>Writing sessions: 35, across 13 different day(s)</w:t>
       </w:r>
     </w:p>
     <w:p>
@@ -94,7 +94,7 @@
         <w:rPr>
           <w:sz w:val="16"/>
         </w:rPr>
-        <w:t>Active writing time (hands on keys): 8 h 8 min</w:t>
+        <w:t>Active writing time (hands on keys): 11 h 49 min</w:t>
       </w:r>
     </w:p>
     <w:p>
@@ -3125,7 +3125,7 @@
               <w:rPr>
                 <w:sz w:val="16"/>
               </w:rPr>
-              <w:t>16:15</w:t>
+              <w:t>16:23</w:t>
             </w:r>
           </w:p>
         </w:tc>
@@ -3141,7 +3141,7 @@
               <w:rPr>
                 <w:sz w:val="16"/>
               </w:rPr>
-              <w:t>4</w:t>
+              <w:t>6</w:t>
             </w:r>
           </w:p>
         </w:tc>
@@ -3178,6 +3178,496 @@
           </w:p>
         </w:tc>
       </w:tr>
+      <w:tr>
+        <w:tc>
+          <w:tcPr>
+            <w:tcW w:type="dxa" w:w="1848"/>
+          </w:tcPr>
+          <w:p>
+            <w:pPr>
+              <w:spacing w:before="0" w:after="0" w:line="240" w:lineRule="auto"/>
+            </w:pPr>
+            <w:r>
+              <w:rPr>
+                <w:sz w:val="16"/>
+              </w:rPr>
+              <w:t>31</w:t>
+            </w:r>
+          </w:p>
+        </w:tc>
+        <w:tc>
+          <w:tcPr>
+            <w:tcW w:type="dxa" w:w="1848"/>
+          </w:tcPr>
+          <w:p>
+            <w:pPr>
+              <w:spacing w:before="0" w:after="0" w:line="240" w:lineRule="auto"/>
+            </w:pPr>
+            <w:r>
+              <w:rPr>
+                <w:sz w:val="16"/>
+              </w:rPr>
+              <w:t>2026-08-29 17:27</w:t>
+            </w:r>
+          </w:p>
+        </w:tc>
+        <w:tc>
+          <w:tcPr>
+            <w:tcW w:type="dxa" w:w="1848"/>
+          </w:tcPr>
+          <w:p>
+            <w:pPr>
+              <w:spacing w:before="0" w:after="0" w:line="240" w:lineRule="auto"/>
+            </w:pPr>
+            <w:r>
+              <w:rPr>
+                <w:sz w:val="16"/>
+              </w:rPr>
+              <w:t>21:50</w:t>
+            </w:r>
+          </w:p>
+        </w:tc>
+        <w:tc>
+          <w:tcPr>
+            <w:tcW w:type="dxa" w:w="1848"/>
+          </w:tcPr>
+          <w:p>
+            <w:pPr>
+              <w:spacing w:before="0" w:after="0" w:line="240" w:lineRule="auto"/>
+            </w:pPr>
+            <w:r>
+              <w:rPr>
+                <w:sz w:val="16"/>
+              </w:rPr>
+              <w:t>445</w:t>
+            </w:r>
+          </w:p>
+        </w:tc>
+        <w:tc>
+          <w:tcPr>
+            <w:tcW w:type="dxa" w:w="1848"/>
+          </w:tcPr>
+          <w:p>
+            <w:pPr>
+              <w:spacing w:before="0" w:after="0" w:line="240" w:lineRule="auto"/>
+            </w:pPr>
+            <w:r>
+              <w:rPr>
+                <w:sz w:val="16"/>
+              </w:rPr>
+              <w:t>5,448 → 6,692</w:t>
+            </w:r>
+          </w:p>
+        </w:tc>
+        <w:tc>
+          <w:tcPr>
+            <w:tcW w:type="dxa" w:w="1848"/>
+          </w:tcPr>
+          <w:p>
+            <w:pPr>
+              <w:spacing w:before="0" w:after="0" w:line="240" w:lineRule="auto"/>
+            </w:pPr>
+            <w:r>
+              <w:rPr>
+                <w:sz w:val="16"/>
+              </w:rPr>
+              <w:t>+1,244</w:t>
+            </w:r>
+          </w:p>
+        </w:tc>
+      </w:tr>
+      <w:tr>
+        <w:tc>
+          <w:tcPr>
+            <w:tcW w:type="dxa" w:w="1848"/>
+          </w:tcPr>
+          <w:p>
+            <w:pPr>
+              <w:spacing w:before="0" w:after="0" w:line="240" w:lineRule="auto"/>
+            </w:pPr>
+            <w:r>
+              <w:rPr>
+                <w:sz w:val="16"/>
+              </w:rPr>
+              <w:t>32</w:t>
+            </w:r>
+          </w:p>
+        </w:tc>
+        <w:tc>
+          <w:tcPr>
+            <w:tcW w:type="dxa" w:w="1848"/>
+          </w:tcPr>
+          <w:p>
+            <w:pPr>
+              <w:spacing w:before="0" w:after="0" w:line="240" w:lineRule="auto"/>
+            </w:pPr>
+            <w:r>
+              <w:rPr>
+                <w:sz w:val="16"/>
+              </w:rPr>
+              <w:t>2026-08-30 06:31</w:t>
+            </w:r>
+          </w:p>
+        </w:tc>
+        <w:tc>
+          <w:tcPr>
+            <w:tcW w:type="dxa" w:w="1848"/>
+          </w:tcPr>
+          <w:p>
+            <w:pPr>
+              <w:spacing w:before="0" w:after="0" w:line="240" w:lineRule="auto"/>
+            </w:pPr>
+            <w:r>
+              <w:rPr>
+                <w:sz w:val="16"/>
+              </w:rPr>
+              <w:t>06:52</w:t>
+            </w:r>
+          </w:p>
+        </w:tc>
+        <w:tc>
+          <w:tcPr>
+            <w:tcW w:type="dxa" w:w="1848"/>
+          </w:tcPr>
+          <w:p>
+            <w:pPr>
+              <w:spacing w:before="0" w:after="0" w:line="240" w:lineRule="auto"/>
+            </w:pPr>
+            <w:r>
+              <w:rPr>
+                <w:sz w:val="16"/>
+              </w:rPr>
+              <w:t>8</w:t>
+            </w:r>
+          </w:p>
+        </w:tc>
+        <w:tc>
+          <w:tcPr>
+            <w:tcW w:type="dxa" w:w="1848"/>
+          </w:tcPr>
+          <w:p>
+            <w:pPr>
+              <w:spacing w:before="0" w:after="0" w:line="240" w:lineRule="auto"/>
+            </w:pPr>
+            <w:r>
+              <w:rPr>
+                <w:sz w:val="16"/>
+              </w:rPr>
+              <w:t>6,692 → 6,692</w:t>
+            </w:r>
+          </w:p>
+        </w:tc>
+        <w:tc>
+          <w:tcPr>
+            <w:tcW w:type="dxa" w:w="1848"/>
+          </w:tcPr>
+          <w:p>
+            <w:pPr>
+              <w:spacing w:before="0" w:after="0" w:line="240" w:lineRule="auto"/>
+            </w:pPr>
+            <w:r>
+              <w:rPr>
+                <w:sz w:val="16"/>
+              </w:rPr>
+              <w:t>+0</w:t>
+            </w:r>
+          </w:p>
+        </w:tc>
+      </w:tr>
+      <w:tr>
+        <w:tc>
+          <w:tcPr>
+            <w:tcW w:type="dxa" w:w="1848"/>
+          </w:tcPr>
+          <w:p>
+            <w:pPr>
+              <w:spacing w:before="0" w:after="0" w:line="240" w:lineRule="auto"/>
+            </w:pPr>
+            <w:r>
+              <w:rPr>
+                <w:sz w:val="16"/>
+              </w:rPr>
+              <w:t>33</w:t>
+            </w:r>
+          </w:p>
+        </w:tc>
+        <w:tc>
+          <w:tcPr>
+            <w:tcW w:type="dxa" w:w="1848"/>
+          </w:tcPr>
+          <w:p>
+            <w:pPr>
+              <w:spacing w:before="0" w:after="0" w:line="240" w:lineRule="auto"/>
+            </w:pPr>
+            <w:r>
+              <w:rPr>
+                <w:sz w:val="16"/>
+              </w:rPr>
+              <w:t>2026-08-30 15:37</w:t>
+            </w:r>
+          </w:p>
+        </w:tc>
+        <w:tc>
+          <w:tcPr>
+            <w:tcW w:type="dxa" w:w="1848"/>
+          </w:tcPr>
+          <w:p>
+            <w:pPr>
+              <w:spacing w:before="0" w:after="0" w:line="240" w:lineRule="auto"/>
+            </w:pPr>
+            <w:r>
+              <w:rPr>
+                <w:sz w:val="16"/>
+              </w:rPr>
+              <w:t>17:54</w:t>
+            </w:r>
+          </w:p>
+        </w:tc>
+        <w:tc>
+          <w:tcPr>
+            <w:tcW w:type="dxa" w:w="1848"/>
+          </w:tcPr>
+          <w:p>
+            <w:pPr>
+              <w:spacing w:before="0" w:after="0" w:line="240" w:lineRule="auto"/>
+            </w:pPr>
+            <w:r>
+              <w:rPr>
+                <w:sz w:val="16"/>
+              </w:rPr>
+              <w:t>230</w:t>
+            </w:r>
+          </w:p>
+        </w:tc>
+        <w:tc>
+          <w:tcPr>
+            <w:tcW w:type="dxa" w:w="1848"/>
+          </w:tcPr>
+          <w:p>
+            <w:pPr>
+              <w:spacing w:before="0" w:after="0" w:line="240" w:lineRule="auto"/>
+            </w:pPr>
+            <w:r>
+              <w:rPr>
+                <w:sz w:val="16"/>
+              </w:rPr>
+              <w:t>6,692 → 6,944</w:t>
+            </w:r>
+          </w:p>
+        </w:tc>
+        <w:tc>
+          <w:tcPr>
+            <w:tcW w:type="dxa" w:w="1848"/>
+          </w:tcPr>
+          <w:p>
+            <w:pPr>
+              <w:spacing w:before="0" w:after="0" w:line="240" w:lineRule="auto"/>
+            </w:pPr>
+            <w:r>
+              <w:rPr>
+                <w:sz w:val="16"/>
+              </w:rPr>
+              <w:t>+252</w:t>
+            </w:r>
+          </w:p>
+        </w:tc>
+      </w:tr>
+      <w:tr>
+        <w:tc>
+          <w:tcPr>
+            <w:tcW w:type="dxa" w:w="1848"/>
+          </w:tcPr>
+          <w:p>
+            <w:pPr>
+              <w:spacing w:before="0" w:after="0" w:line="240" w:lineRule="auto"/>
+            </w:pPr>
+            <w:r>
+              <w:rPr>
+                <w:sz w:val="16"/>
+              </w:rPr>
+              <w:t>34</w:t>
+            </w:r>
+          </w:p>
+        </w:tc>
+        <w:tc>
+          <w:tcPr>
+            <w:tcW w:type="dxa" w:w="1848"/>
+          </w:tcPr>
+          <w:p>
+            <w:pPr>
+              <w:spacing w:before="0" w:after="0" w:line="240" w:lineRule="auto"/>
+            </w:pPr>
+            <w:r>
+              <w:rPr>
+                <w:sz w:val="16"/>
+              </w:rPr>
+              <w:t>2026-08-30 20:09</w:t>
+            </w:r>
+          </w:p>
+        </w:tc>
+        <w:tc>
+          <w:tcPr>
+            <w:tcW w:type="dxa" w:w="1848"/>
+          </w:tcPr>
+          <w:p>
+            <w:pPr>
+              <w:spacing w:before="0" w:after="0" w:line="240" w:lineRule="auto"/>
+            </w:pPr>
+            <w:r>
+              <w:rPr>
+                <w:sz w:val="16"/>
+              </w:rPr>
+              <w:t>20:23</w:t>
+            </w:r>
+          </w:p>
+        </w:tc>
+        <w:tc>
+          <w:tcPr>
+            <w:tcW w:type="dxa" w:w="1848"/>
+          </w:tcPr>
+          <w:p>
+            <w:pPr>
+              <w:spacing w:before="0" w:after="0" w:line="240" w:lineRule="auto"/>
+            </w:pPr>
+            <w:r>
+              <w:rPr>
+                <w:sz w:val="16"/>
+              </w:rPr>
+              <w:t>36</w:t>
+            </w:r>
+          </w:p>
+        </w:tc>
+        <w:tc>
+          <w:tcPr>
+            <w:tcW w:type="dxa" w:w="1848"/>
+          </w:tcPr>
+          <w:p>
+            <w:pPr>
+              <w:spacing w:before="0" w:after="0" w:line="240" w:lineRule="auto"/>
+            </w:pPr>
+            <w:r>
+              <w:rPr>
+                <w:sz w:val="16"/>
+              </w:rPr>
+              <w:t>6,944 → 7,131</w:t>
+            </w:r>
+          </w:p>
+        </w:tc>
+        <w:tc>
+          <w:tcPr>
+            <w:tcW w:type="dxa" w:w="1848"/>
+          </w:tcPr>
+          <w:p>
+            <w:pPr>
+              <w:spacing w:before="0" w:after="0" w:line="240" w:lineRule="auto"/>
+            </w:pPr>
+            <w:r>
+              <w:rPr>
+                <w:sz w:val="16"/>
+              </w:rPr>
+              <w:t>+187</w:t>
+            </w:r>
+          </w:p>
+        </w:tc>
+      </w:tr>
+      <w:tr>
+        <w:tc>
+          <w:tcPr>
+            <w:tcW w:type="dxa" w:w="1848"/>
+          </w:tcPr>
+          <w:p>
+            <w:pPr>
+              <w:spacing w:before="0" w:after="0" w:line="240" w:lineRule="auto"/>
+            </w:pPr>
+            <w:r>
+              <w:rPr>
+                <w:sz w:val="16"/>
+              </w:rPr>
+              <w:t>35</w:t>
+            </w:r>
+          </w:p>
+        </w:tc>
+        <w:tc>
+          <w:tcPr>
+            <w:tcW w:type="dxa" w:w="1848"/>
+          </w:tcPr>
+          <w:p>
+            <w:pPr>
+              <w:spacing w:before="0" w:after="0" w:line="240" w:lineRule="auto"/>
+            </w:pPr>
+            <w:r>
+              <w:rPr>
+                <w:sz w:val="16"/>
+              </w:rPr>
+              <w:t>2026-08-31 13:12</w:t>
+            </w:r>
+          </w:p>
+        </w:tc>
+        <w:tc>
+          <w:tcPr>
+            <w:tcW w:type="dxa" w:w="1848"/>
+          </w:tcPr>
+          <w:p>
+            <w:pPr>
+              <w:spacing w:before="0" w:after="0" w:line="240" w:lineRule="auto"/>
+            </w:pPr>
+            <w:r>
+              <w:rPr>
+                <w:sz w:val="16"/>
+              </w:rPr>
+              <w:t>13:13</w:t>
+            </w:r>
+          </w:p>
+        </w:tc>
+        <w:tc>
+          <w:tcPr>
+            <w:tcW w:type="dxa" w:w="1848"/>
+          </w:tcPr>
+          <w:p>
+            <w:pPr>
+              <w:spacing w:before="0" w:after="0" w:line="240" w:lineRule="auto"/>
+            </w:pPr>
+            <w:r>
+              <w:rPr>
+                <w:sz w:val="16"/>
+              </w:rPr>
+              <w:t>2</w:t>
+            </w:r>
+          </w:p>
+        </w:tc>
+        <w:tc>
+          <w:tcPr>
+            <w:tcW w:type="dxa" w:w="1848"/>
+          </w:tcPr>
+          <w:p>
+            <w:pPr>
+              <w:spacing w:before="0" w:after="0" w:line="240" w:lineRule="auto"/>
+            </w:pPr>
+            <w:r>
+              <w:rPr>
+                <w:sz w:val="16"/>
+              </w:rPr>
+              <w:t>7,131 → 7,131</w:t>
+            </w:r>
+          </w:p>
+        </w:tc>
+        <w:tc>
+          <w:tcPr>
+            <w:tcW w:type="dxa" w:w="1848"/>
+          </w:tcPr>
+          <w:p>
+            <w:pPr>
+              <w:spacing w:before="0" w:after="0" w:line="240" w:lineRule="auto"/>
+            </w:pPr>
+            <w:r>
+              <w:rPr>
+                <w:sz w:val="16"/>
+              </w:rPr>
+              <w:t>+0</w:t>
+            </w:r>
+          </w:p>
+        </w:tc>
+      </w:tr>
     </w:tbl>
     <w:p>
       <w:pPr>
@@ -3199,7 +3689,7 @@
         <w:rPr>
           <w:sz w:val="16"/>
         </w:rPr>
-        <w:t>Of 2283 preserved revisions, 2279 grew by typing-sized steps (under 200 words each).</w:t>
+        <w:t>Of 3006 preserved revisions, 3002 grew by typing-sized steps (under 200 words each).</w:t>
       </w:r>
     </w:p>
     <w:p>
@@ -3286,6 +3776,66 @@
     </w:p>
     <w:p>
       <w:pPr>
+        <w:pStyle w:val="ListBullet"/>
+        <w:spacing w:before="0" w:after="10" w:line="240" w:lineRule="auto"/>
+      </w:pPr>
+      <w:r>
+        <w:rPr>
+          <w:sz w:val="16"/>
+        </w:rPr>
+        <w:t>2026-08-29 17:41: 120 words pasted — “Two verses from Isaiah 66 from Bible Search Lite”</w:t>
+      </w:r>
+    </w:p>
+    <w:p>
+      <w:pPr>
+        <w:pStyle w:val="ListBullet"/>
+        <w:spacing w:before="0" w:after="10" w:line="240" w:lineRule="auto"/>
+      </w:pPr>
+      <w:r>
+        <w:rPr>
+          <w:sz w:val="16"/>
+        </w:rPr>
+        <w:t>2026-08-29 18:27: 176 words pasted — “Passages from Isaiah 66 taken from the Bible Search Lite.”</w:t>
+      </w:r>
+    </w:p>
+    <w:p>
+      <w:pPr>
+        <w:pStyle w:val="ListBullet"/>
+        <w:spacing w:before="0" w:after="10" w:line="240" w:lineRule="auto"/>
+      </w:pPr>
+      <w:r>
+        <w:rPr>
+          <w:sz w:val="16"/>
+        </w:rPr>
+        <w:t>2026-08-29 19:08: 171 words pasted — “Verses from Daniel 11:30-35 from BIble Search Lite.”</w:t>
+      </w:r>
+    </w:p>
+    <w:p>
+      <w:pPr>
+        <w:pStyle w:val="ListBullet"/>
+        <w:spacing w:before="0" w:after="10" w:line="240" w:lineRule="auto"/>
+      </w:pPr>
+      <w:r>
+        <w:rPr>
+          <w:sz w:val="16"/>
+        </w:rPr>
+        <w:t>2026-08-29 19:52: 25 words pasted — “A verse from Matthew 13 shining forth from Bible Search Lite”</w:t>
+      </w:r>
+    </w:p>
+    <w:p>
+      <w:pPr>
+        <w:pStyle w:val="ListBullet"/>
+        <w:spacing w:before="0" w:after="10" w:line="240" w:lineRule="auto"/>
+      </w:pPr>
+      <w:r>
+        <w:rPr>
+          <w:sz w:val="16"/>
+        </w:rPr>
+        <w:t>2026-08-30 16:38: 25 words pasted — “One verse taken from Isaiah 66:16 from the BIble Search Lite.”</w:t>
+      </w:r>
+    </w:p>
+    <w:p>
+      <w:pPr>
         <w:pStyle w:val="Heading2"/>
         <w:spacing w:before="120" w:after="20" w:line="240" w:lineRule="auto"/>
       </w:pPr>
@@ -3304,7 +3854,7 @@
         <w:rPr>
           <w:sz w:val="16"/>
         </w:rPr>
-        <w:t xml:space="preserve">Scored against the writer's style profile (built 2026-08-28 from 3290 documents, 35,703,092 words): distance 0.44, verdict </w:t>
+        <w:t xml:space="preserve">Scored against the writer's style profile (built 2026-08-30 from 2927 documents, 31,827,151 words): distance 0.45, verdict </w:t>
       </w:r>
       <w:r>
         <w:rPr>
@@ -3349,6 +3899,28 @@
       </w:pPr>
       <w:r>
         <w:rPr>
+          <w:sz w:val="16"/>
+        </w:rPr>
+        <w:t>The library's hash chain seals this history: every revision is cryptographically linked to all before it, so none can be altered, inserted, or removed without breaking the chain. At report time its head was:</w:t>
+      </w:r>
+    </w:p>
+    <w:p>
+      <w:pPr>
+        <w:spacing w:before="0" w:after="40" w:line="240" w:lineRule="auto"/>
+      </w:pPr>
+      <w:r>
+        <w:rPr>
+          <w:sz w:val="16"/>
+        </w:rPr>
+        <w:t>`b859d374b2df92f7910edc76597f31fc8cbe6f062060932d5d3c0b4fa87042d1`</w:t>
+      </w:r>
+    </w:p>
+    <w:p>
+      <w:pPr>
+        <w:spacing w:before="0" w:after="40" w:line="240" w:lineRule="auto"/>
+      </w:pPr>
+      <w:r>
+        <w:rPr>
           <w:i/>
           <w:sz w:val="16"/>
         </w:rPr>
@@ -3376,7 +3948,7 @@
         <w:rPr>
           <w:sz w:val="16"/>
         </w:rPr>
-        <w:t>463 misspelling(s) made and corrected (2026-08-18 to 2026-08-28) — the record of real hands on real keys:</w:t>
+        <w:t>635 misspelling(s) made and corrected (2026-08-18 to 2026-08-30) — the record of real hands on real keys:</w:t>
       </w:r>
     </w:p>
     <w:p>
@@ -3387,7 +3959,7 @@
         <w:rPr>
           <w:sz w:val="16"/>
         </w:rPr>
-        <w:t>interprest → interpret;  interprest → interpret;  contsructed → constructed;  contsructed → constructed;  resoning → reasoning; resoning → reasoning;  reasonings → reasoning's;  reasonings → reasoning's;  attpent → attempt;  aquanted → acquainted;  aquanted → acquainted;  enouph → enough;  enouph → enough;  convay → convey; convay → convey;  consept → concept;  consept → concept;  Biblia → Biblical;  conspets → concepts;  conspets → concepts;  identiy → identify;  identiy → identify;  Biblica → Biblical;  reasoningconcepts → concepts;  identifed → identified;  identifed → identified;  conspets → concepts;  consepts → concepts;  consepts → Concepts;  clearity → clarity;  clearity → clarity;  harves → harvest;  harves → harvest; Jubelee → Jubilee;  Jubelee → Jubilee;  trumpted → trumped;  trumpted → trumped;  gentirle → gentile;  naitions → nations;  gentirle → gentile; naitions → nations;  trumpts → trumps;  trumpts → trumps;  Jebalee → Jubilee;  Jebalee → Jubilee;  trumpt → trump;  trumpt → trump;  Jebilee → Jubilee;  Jebilee → Jubilee;  celabrate → celebrate;  celabrate → celebrate;  explanion → explanation;  explanion → explanation; relaation → relation;  inheratance → inheritance;  inheratance → inheritance;  duirng → during;  duirng → during;  responce → response; responce → response;  acomplished → accomplished;  acomplished → accomplished;  trumpt → trump;  trumpt → trump;  captiviy → captivity; captiviy → captivity;  naother → another;  compleation → completion; Juebilee → Jubilee;  compleation → completion;  Juebilee → Jubilee; captiviy → captivity;  captiviy → captivity;  camptive → captive; sabbeth → sabbath;  sabbeth → sabbath;  reasonng → reasoning;  reasonng → reasoning;  pictring → picturing;  int → in;  pictring → picturing; pristly → priestly;  pristly → priestly;  triblation → tribulation; triblation → tribulation;  sanctuarly → sanctuary;  sanctuarly → sanctuary;  lcoation → location;  lcoation → location;  lcoation → location;  throughly → thoroughly;  throughly → thoroughly;  angele → angel;  cuting → cutting;  sactivfied → satisfied;  sactivfied → satisfied;  ths → this;  consepts → Concepts;  secsion → section; secsion → section;  welth → wealth;  infmoration → information; infmoration → information;  persuecuiton → persecution;  persuecuiton → persecution;  enemys → enemy;  enemys → enemy;  similatude → similitude; similatude → similitude;  oint → point;  oint → point;  pristly → priestly;  pristly → priestly;  desided → decided;  desided → decided; complet → complete;  complet → complete;  complet → complete;  complet → complete;  perons → persons;  Imagen → Image;  Imagin → Imagine;  Imagin → Imagine;  praticulaer → particular;  praticulaer → particular; intrest → interest;  intrest → interest;  desolet → desolate;  discution → discussion;  fremament → firmament;  fremament → firmament;  frosake → forsake;  frosake → forsake;  tribultion → tribulation;  tribultion → tribulation;  scatterig → scattering;  frumament → armament;  frumament → armament;  reders → renders;  reders → renders;  aganst → against; aganst → against;  anchent → ancient;  anchent → ancient;  verifeid → verified;  verifeid → verified;  Maichael → Michael;  anchent → ancient; esorted → escorted;  Ths → This;  abominiaton → abomination;  standeth → stands;  imediatly → immediately;  imediatly → immediately;  descreat → discreet;  descreat → discreet;  deepth → depth;  deepth → depth; preceed → proceed;  preceed → proceed;  tribualtion → tribulation; tribualtion → tribulation;  terestrial → terrestrial;  armys → army's; perseuction → persecution;  perseuction → persecution;  desciple → disciple;  desciple → disciple;  intervetion → intervention; intervetion → intervention;  tribuation → tribulation;  tribuation → tribulation;  taberancle → tabernacle;  taberancle → tabernacle; perticularly → particularly;  perticularly → particularly;  langauge → language;  langauge → language;  fuction → function;  fuction → function;  celestila → celestial;  celestila → celestial;  assosated → assisted;  assosated → assisted;  globel → global;  globel → global; preceeded → proceeded;  preceeded → proceeded;  invloving → involving; invloving → involving;  invloved → involved;  tribualtion → tribulation; globel → global;  heavely → heavily;  heavely → heavily;  convlice → conflict;  taberancle → tabernacle;  carriing → carrying;  carriing → carrying;  inheratance → inheritance;  sepeak → speak;  sepeak → speak; Succot → Succoth;  Succot → Succoth;  arrying → carrying;  taberancle → tabernacle;  realted → related;  realted → related;  realted → related; particulary → particularly;  particulary → particularly;  similarites → similarities;  similarites → similarities;  importatn → importation; importatn → importation;  liberations → liberation's;  liberations → liberation's;  ingatheriing → ingathering;  ingatheriing → ingathering; Isreal → Israel;  mirro → mirror;  mirro → mirror;  respets → respects; captivit → captivity;  captivit → captivity;  aparent → apparent; aparent → apparent;  slavry → slavery;  slavry → slavery;  witht → with; Tte → the;  apppoints → points;  witht → with;  assosiated → associated; assosiated → associated;  aquanted → acquainted;  aqujited → acquainted; ith → with;  festivle → festival;  festivle → festival;  harves → harvest;  throught → thought;  decleard → declared;  decleard → declared;  begans → began;  compay → company;  compay → company;  frorm → from;  kindrend → kindred;  kindrend → kindred;  tonges → tongues; tonges → tongues;  agrictural → agricultural;  seasin → season;  shief → sheaf;  shief → sheaf;  planged → planted;  harvens → harvest; celebarted → celebrated;  corispondes → corresponds;  corispondes → corresponds;  natios → nations;  lsavory → savory;  slavory → slavery; slavory → slavery;  intened → intended;  declearation → declaration; declearation → declaration;  kindreds → kindred's;  kindreds → kindred's;  Exo → Exodus;  tanbernacles → tabernacles;  tanbernacles → tabernacles;  Int → In;  requjired → required;  requjired → required; commeorte → commemorate;  commeorte → commemorate;  celbared → celebrate;  celbared → celebrate;  Zec → Zechariah;  prepeariton → preparation;  prepeariton → preparation;  corispond → correspond; corispond → correspond;  durng → during;  tabernccle → tabernacle; tabernccle → tabernacle;  receve → receive;  receve → receive;  Levites → Levite;  Levites → Levite;  Jebilee → Jubilee;  Jebilee → Jubilee; translsed → translated;  translsed → translated;  moltatud → multitude; moltatud → multitude;  Youngs → Young's;  Youngs → Young's;  Youngs → Young's;  Youngs → Young's;  transliaton → translation;  transliaton → translation;  forturs → fortress;  forturs → fortress;  enclusing → enclosing;  enclusing → enclosing;  int → in;  nationc → nation;  enemys → enemy;  Canaanties → Canaanites;  poeriod → period;  poeriod → period; parttern → pattern;  parttern → pattern;  domion → dominion;  Deaper → Deeper;  Deaper → Deeper;  mianing → meaning;  mianing → meaning; Meaining → Meaning;  Meaining → Meaning;  witht → with;  liberbation → liberation;  liberbation → liberation;  assosited → assisted;  assosited → assisted;  tabernatcles → tabernacles;  tabernatcles → tabernacles; assosiated → associated;  assosiisted → associated;  tabels → tables; tabels → tables;  imposistion → imposition;  imposistion → imposition; Jerumiah → Jeremiah;  Jerumiah's → Jeremiah's;  discution → discussion; discution → discussion;  destrcution → destruction;  destrcution → destruction;  int → in;  presnts → presents;  presnts → presents; Dueteronamy → Deuteronomy;  Dueteronamy → Deuteronomy;  suplant → supplant;  Canananites → Canaanites;  suplant → supplant;  Canananites → Canaanites;  discusion → discussion;  discusion → discussion; deliberetly → deliberately;  taberancle → tabernacle;  represnts → represents;  represnts → represents;  statments → statements;  statments → statements;  appling → applying;  appling → applying;  tabernel → tabernacle;  tabernacla → tabernacle;  beging → begging;  beging → begging;  statment → statement;  statment → statement;  possessin → possession;  possessin → possession;  interveation → intervention; interveation → intervention;  reperesnt → represent;  reperesnt → represent;  Isaels → Israels;  suplante → supplant;  suplante → supplant;  globel → global;  immplciations → implications; immplciations → implications;  scholers → scholars;  scholers → scholars;  sanario → scenario;  sanario → scenario;  prophesys → prophesy's;  Daiel → Daniel;  exapnd → expand;  exapnd → expand; hasnting → hasting;  hasning → hsining;  hasning → hsining;  hasening → hastening;  hasening → hastening;  partriarcs → patriarch;  partriarcs → patriarch;  cosistent → consistent;  theam → theme;  theam → theme; inportant → inopportunity;  inportant → inopportunity;  familier → familiar;  familier → familiar;  Levitcus → Leviticus;  Levitcus → Leviticus;  Atoenemt → Atonement;  fi → relate;  bor → born;  delieved → believed;  delieved → believed;  Imediatly → Immediately;  delievered → delivered;  delievered → delivered;  imidiatly → immediately;  imidiatly → immediately;  imidiatly → immediately;  imidiatly → immediately; imidatly → immediately;  imidatly → immediately;  preist → priest; preist → priest;  pristly → priestly;  departer → departure;  pristly → priestly;  comepany → company;  comepany → company;  evey → every; assosiated → associated;  taberancle → tabernacle;  esntial → essential; esntial → essential;  coveant → covenant;  coveant → covenant;  comunity → community;  comunity → community;  sanctary → sanctuary;  sanctary → sanctuary;  posession → possession;  Solomon's → Solomon;  boths → booths;  compleats → completes;  compleats → completes;  selibration → celebration;  selibration → celebration;  taberancles → tabernacles; taberancles → tabernacles;  inheratance → inheritance;  inheratance → inheritance;  comunity → community;  convictat → convicted;  convictat → convicted;  angells → angels;  angells → angels;  delievered → delivered;  corispondes → corresponds;  corispondes → corresponds;  az → a;  toung → tongue;  toung → tongue;  Solomons → Solomon;  convictes → convicts;  convictes → convicts;  represnts → represents;  powor → power;  powor → power</w:t>
+        <w:t>interprest → interpret;  interprest → interpret;  contsructed → constructed;  contsructed → constructed;  resoning → reasoning; resoning → reasoning;  reasonings → reasoning's;  reasonings → reasoning's;  attpent → attempt;  aquanted → acquainted;  aquanted → acquainted;  enouph → enough;  enouph → enough;  convay → convey; convay → convey;  consept → concept;  consept → concept;  Biblia → Biblical;  conspets → concepts;  conspets → concepts;  identiy → identify;  identiy → identify;  Biblica → Biblical;  reasoningconcepts → concepts;  identifed → identified;  identifed → identified;  conspets → concepts;  consepts → concepts;  consepts → Concepts;  clearity → clarity;  clearity → clarity;  harves → harvest;  harves → harvest; Jubelee → Jubilee;  Jubelee → Jubilee;  trumpted → trumped;  trumpted → trumped;  gentirle → gentile;  naitions → nations;  gentirle → gentile; naitions → nations;  trumpts → trumps;  trumpts → trumps;  Jebalee → Jubilee;  Jebalee → Jubilee;  trumpt → trump;  trumpt → trump;  Jebilee → Jubilee;  Jebilee → Jubilee;  celabrate → celebrate;  celabrate → celebrate;  explanion → explanation;  explanion → explanation; relaation → relation;  inheratance → inheritance;  inheratance → inheritance;  duirng → during;  duirng → during;  responce → response; responce → response;  acomplished → accomplished;  acomplished → accomplished;  trumpt → trump;  trumpt → trump;  captiviy → captivity; captiviy → captivity;  naother → another;  compleation → completion; Juebilee → Jubilee;  compleation → completion;  Juebilee → Jubilee; captiviy → captivity;  captiviy → captivity;  camptive → captive; sabbeth → sabbath;  sabbeth → sabbath;  reasonng → reasoning;  reasonng → reasoning;  pictring → picturing;  int → in;  pictring → picturing; pristly → priestly;  pristly → priestly;  triblation → tribulation; triblation → tribulation;  sanctuarly → sanctuary;  sanctuarly → sanctuary;  lcoation → location;  lcoation → location;  lcoation → location;  throughly → thoroughly;  throughly → thoroughly;  angele → angel;  cuting → cutting;  sactivfied → satisfied;  sactivfied → satisfied;  ths → this;  consepts → Concepts;  secsion → section; secsion → section;  welth → wealth;  infmoration → information; infmoration → information;  persuecuiton → persecution;  persuecuiton → persecution;  enemys → enemy;  enemys → enemy;  similatude → similitude; similatude → similitude;  oint → point;  oint → point;  pristly → priestly;  pristly → priestly;  desided → decided;  desided → decided; complet → complete;  complet → complete;  complet → complete;  complet → complete;  perons → persons;  Imagen → Image;  Imagin → Imagine;  Imagin → Imagine;  praticulaer → particular;  praticulaer → particular; intrest → interest;  intrest → interest;  desolet → desolate;  discution → discussion;  fremament → firmament;  fremament → firmament;  frosake → forsake;  frosake → forsake;  tribultion → tribulation;  tribultion → tribulation;  scatterig → scattering;  frumament → armament;  frumament → armament;  reders → renders;  reders → renders;  aganst → against; aganst → against;  anchent → ancient;  anchent → ancient;  verifeid → verified;  verifeid → verified;  Maichael → Michael;  anchent → ancient; esorted → escorted;  Ths → This;  abominiaton → abomination;  standeth → stands;  imediatly → immediately;  imediatly → immediately;  descreat → discreet;  descreat → discreet;  deepth → depth;  deepth → depth; preceed → proceed;  preceed → proceed;  tribualtion → tribulation; tribualtion → tribulation;  terestrial → terrestrial;  armys → army's; perseuction → persecution;  perseuction → persecution;  desciple → disciple;  desciple → disciple;  intervetion → intervention; intervetion → intervention;  tribuation → tribulation;  tribuation → tribulation;  taberancle → tabernacle;  taberancle → tabernacle; perticularly → particularly;  perticularly → particularly;  langauge → language;  langauge → language;  fuction → function;  fuction → function;  celestila → celestial;  celestila → celestial;  assosated → assisted;  assosated → assisted;  globel → global;  globel → global; preceeded → proceeded;  preceeded → proceeded;  invloving → involving; invloving → involving;  invloved → involved;  tribualtion → tribulation; globel → global;  heavely → heavily;  heavely → heavily;  convlice → conflict;  taberancle → tabernacle;  carriing → carrying;  carriing → carrying;  inheratance → inheritance;  sepeak → speak;  sepeak → speak; Succot → Succoth;  Succot → Succoth;  arrying → carrying;  taberancle → tabernacle;  realted → related;  realted → related;  realted → related; particulary → particularly;  particulary → particularly;  similarites → similarities;  similarites → similarities;  importatn → importation; importatn → importation;  liberations → liberation's;  liberations → liberation's;  ingatheriing → ingathering;  ingatheriing → ingathering; Isreal → Israel;  mirro → mirror;  mirro → mirror;  respets → respects; captivit → captivity;  captivit → captivity;  aparent → apparent; aparent → apparent;  slavry → slavery;  slavry → slavery;  witht → with; Tte → the;  apppoints → points;  witht → with;  assosiated → associated; assosiated → associated;  aquanted → acquainted;  aqujited → acquainted; ith → with;  festivle → festival;  festivle → festival;  harves → harvest;  throught → thought;  decleard → declared;  decleard → declared;  begans → began;  compay → company;  compay → company;  frorm → from;  kindrend → kindred;  kindrend → kindred;  tonges → tongues; tonges → tongues;  agrictural → agricultural;  seasin → season;  shief → sheaf;  shief → sheaf;  planged → planted;  harvens → harvest; celebarted → celebrated;  corispondes → corresponds;  corispondes → corresponds;  natios → nations;  lsavory → savory;  slavory → slavery; slavory → slavery;  intened → intended;  declearation → declaration; declearation → declaration;  kindreds → kindred's;  kindreds → kindred's;  Exo → Exodus;  tanbernacles → tabernacles;  tanbernacles → tabernacles;  Int → In;  requjired → required;  requjired → required; commeorte → commemorate;  commeorte → commemorate;  celbared → celebrate;  celbared → celebrate;  Zec → Zechariah;  prepeariton → preparation;  prepeariton → preparation;  corispond → correspond; corispond → correspond;  durng → during;  tabernccle → tabernacle; tabernccle → tabernacle;  receve → receive;  receve → receive;  Levites → Levite;  Levites → Levite;  Jebilee → Jubilee;  Jebilee → Jubilee; translsed → translated;  translsed → translated;  moltatud → multitude; moltatud → multitude;  Youngs → Young's;  Youngs → Young's;  Youngs → Young's;  Youngs → Young's;  transliaton → translation;  transliaton → translation;  forturs → fortress;  forturs → fortress;  enclusing → enclosing;  enclusing → enclosing;  int → in;  nationc → nation;  enemys → enemy;  Canaanties → Canaanites;  poeriod → period;  poeriod → period; parttern → pattern;  parttern → pattern;  domion → dominion;  Deaper → Deeper;  Deaper → Deeper;  mianing → meaning;  mianing → meaning; Meaining → Meaning;  Meaining → Meaning;  witht → with;  liberbation → liberation;  liberbation → liberation;  assosited → assisted;  assosited → assisted;  tabernatcles → tabernacles;  tabernatcles → tabernacles; assosiated → associated;  assosiisted → associated;  tabels → tables; tabels → tables;  imposistion → imposition;  imposistion → imposition; Jerumiah → Jeremiah;  Jerumiah's → Jeremiah's;  discution → discussion; discution → discussion;  destrcution → destruction;  destrcution → destruction;  int → in;  presnts → presents;  presnts → presents; Dueteronamy → Deuteronomy;  Dueteronamy → Deuteronomy;  suplant → supplant;  Canananites → Canaanites;  suplant → supplant;  Canananites → Canaanites;  discusion → discussion;  discusion → discussion; deliberetly → deliberately;  taberancle → tabernacle;  represnts → represents;  represnts → represents;  statments → statements;  statments → statements;  appling → applying;  appling → applying;  tabernel → tabernacle;  tabernacla → tabernacle;  beging → begging;  beging → begging;  statment → statement;  statment → statement;  possessin → possession;  possessin → possession;  interveation → intervention; interveation → intervention;  reperesnt → represent;  reperesnt → represent;  Isaels → Israels;  suplante → supplant;  suplante → supplant;  globel → global;  immplciations → implications; immplciations → implications;  scholers → scholars;  scholers → scholars;  sanario → scenario;  sanario → scenario;  prophesys → prophesy's;  Daiel → Daniel;  exapnd → expand;  exapnd → expand; hasnting → hasting;  hasning → hsining;  hasning → hsining;  hasening → hastening;  hasening → hastening;  partriarcs → patriarch;  partriarcs → patriarch;  cosistent → consistent;  theam → theme;  theam → theme; inportant → inopportunity;  inportant → inopportunity;  familier → familiar;  familier → familiar;  Levitcus → Leviticus;  Levitcus → Leviticus;  Atoenemt → Atonement;  fi → relate;  bor → born;  delieved → believed;  delieved → believed;  Imediatly → Immediately;  delievered → delivered;  delievered → delivered;  imidiatly → immediately;  imidiatly → immediately;  imidiatly → immediately;  imidiatly → immediately; imidatly → immediately;  imidatly → immediately;  preist → priest; preist → priest;  pristly → priestly;  departer → departure;  pristly → priestly;  comepany → company;  comepany → company;  evey → every; assosiated → associated;  taberancle → tabernacle;  esntial → essential; esntial → essential;  coveant → covenant;  coveant → covenant;  comunity → community;  comunity → community;  sanctary → sanctuary;  sanctary → sanctuary;  posession → possession;  Solomon's → Solomon;  boths → booths;  compleats → completes;  compleats → completes;  selibration → celebration;  selibration → celebration;  taberancles → tabernacles; taberancles → tabernacles;  inheratance → inheritance;  inheratance → inheritance;  comunity → community;  convictat → convicted;  convictat → convicted;  angells → angels;  angells → angels;  delievered → delivered;  corispondes → corresponds;  corispondes → corresponds;  az → a;  toung → tongue;  toung → tongue;  Solomons → Solomon;  convictes → convicts;  convictes → convicts;  represnts → represents;  powor → power;  powor → power;  statment → statement;  remen → remnant;  Michai → Micah;  Michai → Micah;  unitl → until;  emnant → remnant;  harves → harvest;  naitons → nations;  naitons → nations;  durng → during; taberancle → tabernacle;  celebraded → celebrated;  celebraded → celebrated;  persucuts → prosecutes;  persucuts → prosecutes; prosecuter → prosecutor;  prosecuter → prosecutor;  brethern → brethren; brethern → brethren;  rendereth → rendered;  rendereth → rendered; rendereth → rendered;  rendereth → rendered;  rendereth → rendered; rendereth → rendered;  recompence → recompense;  recompence → recompense;  recompence → recompense;  recompence → recompense; recompence → recompense;  recompence → recompense;  bretheren → brethren;  bretheren → brethren;  scatterd → scattered;  scatterd → scattered;  rejoucing → rejoicing;  rejoucing → rejoicing;  perscuted → prosecuted;  perscuted → prosecuted;  trhere → there;  perrosecutor → persecutor;  brethern → brethren;  brethern → brethren;  persecuts → persecutes;  renderes → renders;  renderes → renders;  brethern → brethren;  int → in;  brethern → brethren;  unitl → until;  appart → apart;  appart → apart;  harves → harvest;  framwork → framework; framwork → framework;  desolet → desolate;  flatteries → flatters; intelligens → intelligence;  tribuation → tribulation;  persection → persecution;  persection → persecution;  int → in;  tribuation → tribulation;  lifeted → lifted;  lifeted → lifted;  Levites → Levite; hsi → his;  aganst → against;  Levites → Levite;  Levites → Levite; consecreat → consecrate;  consecreat → consecrate;  abomiation → abomination;  abomiation → abomination;  servive → survive;  servive → survive;  tribution → retribution;  tribution → retribution; tribulaiton → tribulation;  tribulaiton → tribulation;  tribution → tribulation;  tribution → tribulation;  throught → thought;  taberanacle → tabernacle;  taberanacle → tabernacle;  Levites → Levies;  Levites → Levies;  relaevent → relevant;  relaevent → relevant;  antions → nations;  misst → midst;  possale → possible;  possale → possible; estaablishing → establishing;  estaablishing → establishing;  covenat → covenant;  covenat → covenant;  Levites → Levies;  Levites → Levies; Levites → Levies;  Levites → Levies;  choses → chooses;  holyness → holiness;  holyness → holiness;  goden → golden;  Levites → Levies; drectly → directly;  drectly → directly;  esental → essential;  esental → essential;  gardeans → guardians;  gardeans → guardians;  pristly → priestly;  fuction → function;  appart → apart;  Ishamel → Ishmael; Ishamel → Ishmael;  Abraam → Abraham;  Abraam → Abraham;  consicrated → consecrated;  consicrated → consecrated;  brethern → brethren;  persecut → prosecute;  persecut → prosecute;  recompens → recompense;  recompens → recompense;  perosecute → persecute;  fleel → flee;  agains → against; agains → against;  persacution → persecution;  brith → birth;  brith → birth;  oposition → opposition;  possable → po;  choses → chooses; Levites → Levies;  Levites → Levies;  Levites → Levies;  trib → tribe; pristrly → priestly;  pristrly → priestly;  delievered → delivered; deliverd → delivered;  deliverd → delivered;  Levites → Levies;  Levites → Levies;  Levites → Levies;  easly → be;  harves → harvest; destingished → distinguished;  destingished → distinguished;  fisible → visible;  differnce → difference;  differnce → difference;  prist → priest;  prist → priest;  Egyption → Egyptian;  Egyption → Egyptian; represnt → represent;  represnt → represent;  persucting → prosecuting; persucting → prosecuting;  lotst → lots;  secrest → secrets;  secrest → secrets;  hideen → hidden;  broughtr → brought;  broughtr → brought; Malichi → Malachi;  Malichi → Malachi;  sould → souls</w:t>
       </w:r>
     </w:p>
     <w:sectPr>

</xml_diff>